<commit_message>
feat(course-syllabus-compiler): upgrade to 2.3.0-web-core
</commit_message>
<xml_diff>
--- a/skills/course-syllabus-compiler/assets/syllabus-master.docx
+++ b/skills/course-syllabus-compiler/assets/syllabus-master.docx
@@ -21,12 +21,13 @@
       <w:jc w:val="center"/>
     </w:pPr>
     <w:r>
-      <w:fldChar w:fldCharType="begin"/>
-      <w:instrText xml:space="preserve"> PAGE </w:instrText>
-      <w:fldChar w:fldCharType="separate"/>
-      <w:t>1</w:t>
-      <w:fldChar w:fldCharType="end"/>
+      <w:rPr>
+        <w:rFonts w:ascii="Times New Roman" w:hAnsi="Times New Roman" w:eastAsia="宋体"/>
+        <w:b w:val="0"/>
+        <w:sz w:val="18"/>
+      </w:rPr>
     </w:r>
+    <w:fldSimple w:instr="PAGE"/>
   </w:p>
 </w:ftr>
 </file>
@@ -394,12 +395,8 @@
     <w:name w:val="Normal"/>
     <w:qFormat/>
     <w:rsid w:val="00FC693F"/>
-    <w:pPr>
-      <w:spacing w:line="300" w:lineRule="auto" w:after="0"/>
-    </w:pPr>
     <w:rPr>
       <w:rFonts w:ascii="Times New Roman" w:hAnsi="Times New Roman" w:eastAsia="宋体"/>
-      <w:color w:val="000000"/>
       <w:sz w:val="21"/>
     </w:rPr>
   </w:style>
@@ -458,16 +455,15 @@
     <w:pPr>
       <w:keepNext/>
       <w:keepLines/>
-      <w:spacing w:before="240" w:after="160"/>
-      <w:jc w:val="left"/>
+      <w:spacing w:before="480" w:after="0"/>
       <w:outlineLvl w:val="0"/>
     </w:pPr>
     <w:rPr>
-      <w:rFonts w:asciiTheme="majorHAnsi" w:eastAsiaTheme="majorEastAsia" w:hAnsiTheme="majorHAnsi" w:cstheme="majorBidi" w:ascii="Times New Roman" w:hAnsi="Times New Roman" w:eastAsia="黑体"/>
+      <w:rFonts w:asciiTheme="majorHAnsi" w:eastAsiaTheme="majorEastAsia" w:hAnsiTheme="majorHAnsi" w:cstheme="majorBidi"/>
       <w:b/>
       <w:bCs/>
-      <w:color w:val="000000"/>
-      <w:sz w:val="32"/>
+      <w:color w:val="365F91" w:themeColor="accent1" w:themeShade="BF"/>
+      <w:sz w:val="28"/>
       <w:szCs w:val="28"/>
     </w:rPr>
   </w:style>
@@ -483,16 +479,15 @@
     <w:pPr>
       <w:keepNext/>
       <w:keepLines/>
-      <w:spacing w:before="160" w:after="80"/>
-      <w:jc w:val="left"/>
+      <w:spacing w:before="200" w:after="0"/>
       <w:outlineLvl w:val="1"/>
     </w:pPr>
     <w:rPr>
-      <w:rFonts w:asciiTheme="majorHAnsi" w:eastAsiaTheme="majorEastAsia" w:hAnsiTheme="majorHAnsi" w:cstheme="majorBidi" w:ascii="Times New Roman" w:hAnsi="Times New Roman" w:eastAsia="黑体"/>
+      <w:rFonts w:asciiTheme="majorHAnsi" w:eastAsiaTheme="majorEastAsia" w:hAnsiTheme="majorHAnsi" w:cstheme="majorBidi"/>
       <w:b/>
       <w:bCs/>
-      <w:color w:val="000000"/>
-      <w:sz w:val="24"/>
+      <w:color w:val="4F81BD" w:themeColor="accent1"/>
+      <w:sz w:val="26"/>
       <w:szCs w:val="26"/>
     </w:rPr>
   </w:style>
@@ -746,17 +741,18 @@
     <w:qFormat/>
     <w:rsid w:val="00FC693F"/>
     <w:pPr>
-      <w:spacing w:after="240" w:line="240" w:lineRule="auto" w:before="240"/>
+      <w:pBdr>
+        <w:bottom w:val="single" w:sz="8" w:space="4" w:color="4F81BD" w:themeColor="accent1"/>
+      </w:pBdr>
+      <w:spacing w:after="300" w:line="240" w:lineRule="auto"/>
       <w:contextualSpacing/>
-      <w:jc w:val="center"/>
     </w:pPr>
     <w:rPr>
-      <w:rFonts w:asciiTheme="majorHAnsi" w:eastAsiaTheme="majorEastAsia" w:hAnsiTheme="majorHAnsi" w:cstheme="majorBidi" w:ascii="Times New Roman" w:hAnsi="Times New Roman" w:eastAsia="黑体"/>
-      <w:b/>
-      <w:color w:val="000000"/>
+      <w:rFonts w:asciiTheme="majorHAnsi" w:eastAsiaTheme="majorEastAsia" w:hAnsiTheme="majorHAnsi" w:cstheme="majorBidi"/>
+      <w:color w:val="17365D" w:themeColor="text2" w:themeShade="BF"/>
       <w:spacing w:val="5"/>
       <w:kern w:val="28"/>
-      <w:sz w:val="32"/>
+      <w:sz w:val="52"/>
       <w:szCs w:val="52"/>
     </w:rPr>
   </w:style>
@@ -12085,17 +12081,6 @@
         <w:shd w:val="clear" w:color="auto" w:fill="FBCAA2" w:themeFill="accent6" w:themeFillTint="7F"/>
       </w:tcPr>
     </w:tblStylePr>
-  </w:style>
-  <w:style w:type="paragraph" w:customStyle="1" w:styleId="SyllabusTableText">
-    <w:name w:val="Syllabus Table Text"/>
-    <w:pPr>
-      <w:spacing w:after="0" w:line="240" w:lineRule="auto"/>
-    </w:pPr>
-    <w:rPr>
-      <w:rFonts w:ascii="Times New Roman" w:hAnsi="Times New Roman" w:eastAsia="宋体"/>
-      <w:color w:val="000000"/>
-      <w:sz w:val="18"/>
-    </w:rPr>
   </w:style>
 </w:styles>
 </file>

</xml_diff>